<commit_message>
Add the backup reminder to the end-of-protocol lines in the Word file
Each green "Phase 1 is complete" line in Protocol_instructions.docx now
reminds coders to download a backup if it is their last paper of the session.

Co-Authored-By: Claude Opus 5.5 <noreply@anthropic.com>
</commit_message>
<xml_diff>
--- a/Protocol_instructions.docx
+++ b/Protocol_instructions.docx
@@ -6010,6 +6010,24 @@
         </w:rPr>
         <w:t xml:space="preserve">✓ If Q1 = "I am unable to access the journal website or the supplementary materials shared there because of a paywall": Phase 1 is complete for this paper (it will be assessed by an additional coder). Move to the next paper.</w:t>
       </w:r>
+      <w:r>
+        <w:rPr>
+          <w:rFonts w:ascii="Arial" w:eastAsia="Times New Roman" w:hAnsi="Arial" w:cs="Arial"/>
+          <w:color w:val="375623"/>
+          <w:sz w:val="18"/>
+          <w:szCs w:val="18"/>
+        </w:rPr>
+        <w:br/>
+      </w:r>
+      <w:r>
+        <w:rPr>
+          <w:rFonts w:ascii="Arial" w:eastAsia="Times New Roman" w:hAnsi="Arial" w:cs="Arial"/>
+          <w:color w:val="375623"/>
+          <w:sz w:val="18"/>
+          <w:szCs w:val="18"/>
+        </w:rPr>
+        <w:t xml:space="preserve">If this is the last paper you plan to code this session, please do not forget to download a backup to your computer.</w:t>
+      </w:r>
     </w:p>
     <w:p>
       <w:pPr>
@@ -14022,6 +14040,24 @@
         </w:rPr>
         <w:t xml:space="preserve">✓ If Q4 = "Unambiguously insufficient" or "Unable to open file(s)": Phase 1 is complete for this paper. Move to the next paper.</w:t>
       </w:r>
+      <w:r>
+        <w:rPr>
+          <w:rFonts w:ascii="Arial" w:eastAsia="Times New Roman" w:hAnsi="Arial" w:cs="Arial"/>
+          <w:color w:val="375623"/>
+          <w:sz w:val="18"/>
+          <w:szCs w:val="18"/>
+        </w:rPr>
+        <w:br/>
+      </w:r>
+      <w:r>
+        <w:rPr>
+          <w:rFonts w:ascii="Arial" w:eastAsia="Times New Roman" w:hAnsi="Arial" w:cs="Arial"/>
+          <w:color w:val="375623"/>
+          <w:sz w:val="18"/>
+          <w:szCs w:val="18"/>
+        </w:rPr>
+        <w:t xml:space="preserve">If this is the last paper you plan to code this session, please do not forget to download a backup to your computer.</w:t>
+      </w:r>
     </w:p>
     <w:p>
       <w:pPr>
@@ -15286,6 +15322,24 @@
         </w:rPr>
         <w:t xml:space="preserve">✓ After Section 2B, Phase 1 is complete for this paper. Move to the next paper.</w:t>
       </w:r>
+      <w:r>
+        <w:rPr>
+          <w:rFonts w:ascii="Arial" w:eastAsia="Times New Roman" w:hAnsi="Arial" w:cs="Arial"/>
+          <w:color w:val="375623"/>
+          <w:sz w:val="18"/>
+          <w:szCs w:val="18"/>
+        </w:rPr>
+        <w:br/>
+      </w:r>
+      <w:r>
+        <w:rPr>
+          <w:rFonts w:ascii="Arial" w:eastAsia="Times New Roman" w:hAnsi="Arial" w:cs="Arial"/>
+          <w:color w:val="375623"/>
+          <w:sz w:val="18"/>
+          <w:szCs w:val="18"/>
+        </w:rPr>
+        <w:t xml:space="preserve">If this is the last paper you plan to code this session, please do not forget to download a backup to your computer.</w:t>
+      </w:r>
     </w:p>
     <w:p>
       <w:pPr>
@@ -17409,7 +17463,50 @@
           <w:sz w:val="19"/>
           <w:szCs w:val="19"/>
         </w:rPr>
-        <w:t xml:space="preserve">✓ If "No": Phase 1 is complete for this paper. Move to the next paper. If "Yes": continue with Section 3B.</w:t>
+        <w:t xml:space="preserve">✓ If "No": Phase 1 is complete for this paper. Move to the next paper.</w:t>
+      </w:r>
+      <w:r>
+        <w:rPr>
+          <w:rFonts w:ascii="Arial" w:eastAsia="Times New Roman" w:hAnsi="Arial" w:cs="Arial"/>
+          <w:color w:val="375623"/>
+          <w:sz w:val="18"/>
+          <w:szCs w:val="18"/>
+        </w:rPr>
+        <w:br/>
+      </w:r>
+      <w:r>
+        <w:rPr>
+          <w:rFonts w:ascii="Arial" w:eastAsia="Times New Roman" w:hAnsi="Arial" w:cs="Arial"/>
+          <w:color w:val="375623"/>
+          <w:sz w:val="18"/>
+          <w:szCs w:val="18"/>
+        </w:rPr>
+        <w:t xml:space="preserve">If this is the last paper you plan to code this session, please do not forget to download a backup to your computer.</w:t>
+      </w:r>
+    </w:p>
+    <w:p>
+      <w:pPr>
+        <w:keepNext/>
+        <w:spacing w:before="120" w:after="80"/>
+        <w:rPr>
+          <w:rFonts w:ascii="Arial" w:eastAsia="Times New Roman" w:hAnsi="Arial" w:cs="Arial"/>
+          <w:b/>
+          <w:bCs/>
+          <w:color w:val="0070C0"/>
+          <w:sz w:val="19"/>
+          <w:szCs w:val="19"/>
+        </w:rPr>
+      </w:pPr>
+      <w:r>
+        <w:rPr>
+          <w:rFonts w:ascii="Arial" w:eastAsia="Times New Roman" w:hAnsi="Arial" w:cs="Arial"/>
+          <w:b/>
+          <w:bCs/>
+          <w:color w:val="0070C0"/>
+          <w:sz w:val="19"/>
+          <w:szCs w:val="19"/>
+        </w:rPr>
+        <w:t xml:space="preserve">→ If "Yes": continue with Section 3B.</w:t>
       </w:r>
     </w:p>
     <w:p>
@@ -18523,6 +18620,24 @@
           <w:szCs w:val="19"/>
         </w:rPr>
         <w:t xml:space="preserve">✓ After recording the ITR, Phase 1 is complete for this paper. Move to the next paper.</w:t>
+      </w:r>
+      <w:r>
+        <w:rPr>
+          <w:rFonts w:ascii="Arial" w:eastAsia="Times New Roman" w:hAnsi="Arial" w:cs="Arial"/>
+          <w:color w:val="375623"/>
+          <w:sz w:val="18"/>
+          <w:szCs w:val="18"/>
+        </w:rPr>
+        <w:br/>
+      </w:r>
+      <w:r>
+        <w:rPr>
+          <w:rFonts w:ascii="Arial" w:eastAsia="Times New Roman" w:hAnsi="Arial" w:cs="Arial"/>
+          <w:color w:val="375623"/>
+          <w:sz w:val="18"/>
+          <w:szCs w:val="18"/>
+        </w:rPr>
+        <w:t xml:space="preserve">If this is the last paper you plan to code this session, please do not forget to download a backup to your computer.</w:t>
       </w:r>
     </w:p>
     <w:p>

</xml_diff>